<commit_message>
written about edges in raport
</commit_message>
<xml_diff>
--- a/Rapport.docx
+++ b/Rapport.docx
@@ -239,6 +239,9 @@
         <w:tab/>
         <w:t>Morten Sletta</w:t>
       </w:r>
+      <w:r>
+        <w:t>-Heimdal</w:t>
+      </w:r>
     </w:p>
     <w:p>
       <w:pPr>
@@ -353,6 +356,7 @@
           <w:lang w:val="en-US"/>
         </w:rPr>
         <w:tab/>
+        <w:t>Machine vision for real time dete</w:t>
       </w:r>
       <w:r>
         <w:rPr>
@@ -360,31 +364,7 @@
           <w:szCs w:val="24"/>
           <w:lang w:val="en-US"/>
         </w:rPr>
-        <w:t>M</w:t>
-      </w:r>
-      <w:r>
-        <w:rPr>
-          <w:sz w:val="24"/>
-          <w:szCs w:val="24"/>
-          <w:lang w:val="en-US"/>
-        </w:rPr>
-        <w:t xml:space="preserve">achine vision </w:t>
-      </w:r>
-      <w:r>
-        <w:rPr>
-          <w:sz w:val="24"/>
-          <w:szCs w:val="24"/>
-          <w:lang w:val="en-US"/>
-        </w:rPr>
-        <w:t>for r</w:t>
-      </w:r>
-      <w:r>
-        <w:rPr>
-          <w:sz w:val="24"/>
-          <w:szCs w:val="24"/>
-          <w:lang w:val="en-US"/>
-        </w:rPr>
-        <w:t>eal time detection of net damage in sea cages</w:t>
+        <w:t>ction of net damage in sea cages</w:t>
       </w:r>
     </w:p>
     <w:p>
@@ -5025,14 +5005,7 @@
           <w:i/>
           <w:lang w:val="en-US"/>
         </w:rPr>
-        <w:t>Lepeophteirus salmonis</w:t>
-      </w:r>
-      <w:r>
-        <w:rPr>
-          <w:i/>
-          <w:lang w:val="en-US"/>
-        </w:rPr>
-        <w:t xml:space="preserve"> </w:t>
+        <w:t xml:space="preserve">Lepeophteirus salmonis </w:t>
       </w:r>
       <w:r>
         <w:rPr>
@@ -5151,13 +5124,7 @@
         <w:rPr>
           <w:lang w:val="en-US"/>
         </w:rPr>
-        <w:t xml:space="preserve"> many interesting numbers about aquaculture in Norway can be found. In Norway 3.93 million salmon and 0.98 million rainbow trout escaped in the span 2001-2009, while 1.05 million cod escaped in the span 2004-2009. This seems a lot but as an example there was at any given time in 2009 approximately 310 million Atlantic salmon and rainbow trout in sea cages in Norway. </w:t>
-      </w:r>
-      <w:r>
-        <w:rPr>
-          <w:lang w:val="en-US"/>
-        </w:rPr>
-        <w:t>It seems that cod is especially hard to prevent from escaping. While the salmon escapes mainly after structural failures of containment equipment the cod escapes more often through holes in the net.</w:t>
+        <w:t xml:space="preserve"> many interesting numbers about aquaculture in Norway can be found. In Norway 3.93 million salmon and 0.98 million rainbow trout escaped in the span 2001-2009, while 1.05 million cod escaped in the span 2004-2009. This seems a lot but as an example there was at any given time in 2009 approximately 310 million Atlantic salmon and rainbow trout in sea cages in Norway. It seems that cod is especially hard to prevent from escaping. While the salmon escapes mainly after structural failures of containment equipment the cod escapes more often through holes in the net.</w:t>
       </w:r>
     </w:p>
     <w:p>
@@ -5218,13 +5185,7 @@
         <w:rPr>
           <w:lang w:val="en-US"/>
         </w:rPr>
-        <w:t xml:space="preserve"> escaped incidents in Scottish aquaculture are reviewed. </w:t>
-      </w:r>
-      <w:r>
-        <w:rPr>
-          <w:lang w:val="en-US"/>
-        </w:rPr>
-        <w:t xml:space="preserve">In Scottish aquaculture the most common cause of escape incidents is holes in the net. Of the reported incidents from May 2002 to October 2009 57% of the incidents were due to holes in the net, which led to a total of 700.359 escaped fish. Incidents caused by predation and chafe/snag are the two most frequently occurring causes for holes in the net. </w:t>
+        <w:t xml:space="preserve"> escaped incidents in Scottish aquaculture are reviewed. In Scottish aquaculture the most common cause of escape incidents is holes in the net. Of the reported incidents from May 2002 to October 2009 57% of the incidents were due to holes in the net, which led to a total of 700.359 escaped fish. Incidents caused by predation and chafe/snag are the two most frequently occurring causes for holes in the net. </w:t>
       </w:r>
     </w:p>
     <w:p>
@@ -7514,8 +7475,6 @@
         </w:rPr>
         <w:t xml:space="preserve"> </w:t>
       </w:r>
-      <w:bookmarkStart w:id="25" w:name="_GoBack"/>
-      <w:bookmarkEnd w:id="25"/>
     </w:p>
     <w:p>
       <w:pPr>
@@ -7581,7 +7540,7 @@
           <w:lang w:val="en-US"/>
         </w:rPr>
       </w:pPr>
-      <w:bookmarkStart w:id="26" w:name="_Ref352065762"/>
+      <w:bookmarkStart w:id="25" w:name="_Ref352065762"/>
       <w:r>
         <w:rPr>
           <w:lang w:val="en-US"/>
@@ -7610,7 +7569,7 @@
       <w:r>
         <w:fldChar w:fldCharType="end"/>
       </w:r>
-      <w:bookmarkEnd w:id="26"/>
+      <w:bookmarkEnd w:id="25"/>
       <w:r>
         <w:rPr>
           <w:lang w:val="en-US"/>
@@ -7666,14 +7625,14 @@
           <w:lang w:val="en-US"/>
         </w:rPr>
       </w:pPr>
-      <w:bookmarkStart w:id="27" w:name="_Ref350861671"/>
-      <w:bookmarkStart w:id="28" w:name="_Ref350861696"/>
-      <w:bookmarkStart w:id="29" w:name="_Ref350861701"/>
-      <w:bookmarkStart w:id="30" w:name="_Ref350861709"/>
-      <w:bookmarkStart w:id="31" w:name="_Ref350861712"/>
-      <w:bookmarkStart w:id="32" w:name="_Ref350861729"/>
-      <w:bookmarkStart w:id="33" w:name="_Ref350861732"/>
-      <w:bookmarkStart w:id="34" w:name="_Toc352058893"/>
+      <w:bookmarkStart w:id="26" w:name="_Ref350861671"/>
+      <w:bookmarkStart w:id="27" w:name="_Ref350861696"/>
+      <w:bookmarkStart w:id="28" w:name="_Ref350861701"/>
+      <w:bookmarkStart w:id="29" w:name="_Ref350861709"/>
+      <w:bookmarkStart w:id="30" w:name="_Ref350861712"/>
+      <w:bookmarkStart w:id="31" w:name="_Ref350861729"/>
+      <w:bookmarkStart w:id="32" w:name="_Ref350861732"/>
+      <w:bookmarkStart w:id="33" w:name="_Toc352058893"/>
       <w:r>
         <w:rPr>
           <w:lang w:val="en-US"/>
@@ -7687,6 +7646,7 @@
         </w:rPr>
         <w:t>xyY</w:t>
       </w:r>
+      <w:bookmarkEnd w:id="26"/>
       <w:bookmarkEnd w:id="27"/>
       <w:bookmarkEnd w:id="28"/>
       <w:bookmarkEnd w:id="29"/>
@@ -7694,7 +7654,6 @@
       <w:bookmarkEnd w:id="31"/>
       <w:bookmarkEnd w:id="32"/>
       <w:bookmarkEnd w:id="33"/>
-      <w:bookmarkEnd w:id="34"/>
       <w:proofErr w:type="spellEnd"/>
     </w:p>
     <w:p>
@@ -7841,24 +7800,14 @@
       <w:r>
         <w:t xml:space="preserve">Equation </w:t>
       </w:r>
-      <w:r>
-        <w:fldChar w:fldCharType="begin"/>
-      </w:r>
-      <w:r>
-        <w:instrText xml:space="preserve"> SEQ Equation \* ARABIC </w:instrText>
-      </w:r>
-      <w:r>
-        <w:fldChar w:fldCharType="separate"/>
-      </w:r>
-      <w:r>
-        <w:rPr>
-          <w:noProof/>
-        </w:rPr>
-        <w:t>1</w:t>
-      </w:r>
-      <w:r>
-        <w:fldChar w:fldCharType="end"/>
-      </w:r>
+      <w:fldSimple w:instr=" SEQ Equation \* ARABIC ">
+        <w:r>
+          <w:rPr>
+            <w:noProof/>
+          </w:rPr>
+          <w:t>1</w:t>
+        </w:r>
+      </w:fldSimple>
       <w:r>
         <w:t>: XYZ to xyY</w:t>
       </w:r>
@@ -7881,7 +7830,7 @@
           <w:lang w:val="en-US"/>
         </w:rPr>
       </w:pPr>
-      <w:bookmarkStart w:id="35" w:name="_Toc352058894"/>
+      <w:bookmarkStart w:id="34" w:name="_Toc352058894"/>
       <w:r>
         <w:rPr>
           <w:lang w:val="en-US"/>
@@ -7894,7 +7843,7 @@
         </w:rPr>
         <w:t>L*a*b</w:t>
       </w:r>
-      <w:bookmarkEnd w:id="35"/>
+      <w:bookmarkEnd w:id="34"/>
     </w:p>
     <w:p>
       <w:pPr>
@@ -8116,7 +8065,7 @@
           <w:lang w:val="en-US"/>
         </w:rPr>
       </w:pPr>
-      <w:bookmarkStart w:id="36" w:name="_Ref351365883"/>
+      <w:bookmarkStart w:id="35" w:name="_Ref351365883"/>
       <w:r>
         <w:rPr>
           <w:lang w:val="en-US"/>
@@ -8145,7 +8094,7 @@
       <w:r>
         <w:fldChar w:fldCharType="end"/>
       </w:r>
-      <w:bookmarkEnd w:id="36"/>
+      <w:bookmarkEnd w:id="35"/>
       <w:r>
         <w:rPr>
           <w:lang w:val="en-US"/>
@@ -8226,14 +8175,14 @@
           <w:lang w:val="en-US"/>
         </w:rPr>
       </w:pPr>
-      <w:bookmarkStart w:id="37" w:name="_Toc352058895"/>
+      <w:bookmarkStart w:id="36" w:name="_Toc352058895"/>
       <w:r>
         <w:rPr>
           <w:lang w:val="en-US"/>
         </w:rPr>
         <w:t>Segmentation methods</w:t>
       </w:r>
-      <w:bookmarkEnd w:id="37"/>
+      <w:bookmarkEnd w:id="36"/>
     </w:p>
     <w:p>
       <w:pPr>
@@ -8338,7 +8287,7 @@
           <w:lang w:val="en-US"/>
         </w:rPr>
       </w:pPr>
-      <w:bookmarkStart w:id="38" w:name="_Toc352058896"/>
+      <w:bookmarkStart w:id="37" w:name="_Toc352058896"/>
       <w:r>
         <w:rPr>
           <w:lang w:val="en-US"/>
@@ -8357,7 +8306,7 @@
         </w:rPr>
         <w:t>Thresholding</w:t>
       </w:r>
-      <w:bookmarkEnd w:id="38"/>
+      <w:bookmarkEnd w:id="37"/>
     </w:p>
     <w:p>
       <w:pPr>
@@ -8389,21 +8338,21 @@
           <w:lang w:val="en-US"/>
         </w:rPr>
       </w:pPr>
-      <w:bookmarkStart w:id="39" w:name="_Toc352058897"/>
+      <w:bookmarkStart w:id="38" w:name="_Toc352058897"/>
       <w:r>
         <w:rPr>
           <w:lang w:val="en-US"/>
         </w:rPr>
         <w:t xml:space="preserve">Adaptive </w:t>
       </w:r>
-      <w:commentRangeStart w:id="40"/>
+      <w:commentRangeStart w:id="39"/>
       <w:r>
         <w:rPr>
           <w:lang w:val="en-US"/>
         </w:rPr>
         <w:t>thresholding</w:t>
       </w:r>
-      <w:commentRangeEnd w:id="40"/>
+      <w:commentRangeEnd w:id="39"/>
       <w:r>
         <w:rPr>
           <w:rStyle w:val="CommentReference"/>
@@ -8412,9 +8361,9 @@
           <w:bCs w:val="0"/>
           <w:color w:val="auto"/>
         </w:rPr>
-        <w:commentReference w:id="40"/>
-      </w:r>
-      <w:bookmarkEnd w:id="39"/>
+        <w:commentReference w:id="39"/>
+      </w:r>
+      <w:bookmarkEnd w:id="38"/>
     </w:p>
     <w:p>
       <w:pPr>
@@ -8434,7 +8383,7 @@
           <w:lang w:val="en-US"/>
         </w:rPr>
       </w:pPr>
-      <w:bookmarkStart w:id="41" w:name="_Toc352058898"/>
+      <w:bookmarkStart w:id="40" w:name="_Toc352058898"/>
       <w:r>
         <w:rPr>
           <w:lang w:val="en-US"/>
@@ -8447,7 +8396,7 @@
         </w:rPr>
         <w:t xml:space="preserve"> method</w:t>
       </w:r>
-      <w:bookmarkEnd w:id="41"/>
+      <w:bookmarkEnd w:id="40"/>
     </w:p>
     <w:p>
       <w:pPr>
@@ -9388,21 +9337,126 @@
           <w:lang w:val="en-US"/>
         </w:rPr>
       </w:pPr>
-      <w:bookmarkStart w:id="42" w:name="_Toc352058899"/>
+      <w:bookmarkStart w:id="41" w:name="_Toc352058899"/>
       <w:r>
         <w:rPr>
           <w:lang w:val="en-US"/>
         </w:rPr>
         <w:t>Using Edge detection</w:t>
       </w:r>
+      <w:bookmarkEnd w:id="41"/>
+    </w:p>
+    <w:p>
+      <w:pPr>
+        <w:rPr>
+          <w:lang w:val="en-US"/>
+        </w:rPr>
+      </w:pPr>
+      <w:r>
+        <w:rPr>
+          <w:lang w:val="en-US"/>
+        </w:rPr>
+        <w:t xml:space="preserve">In </w:t>
+      </w:r>
+      <w:sdt>
+        <w:sdtPr>
+          <w:rPr>
+            <w:lang w:val="en-US"/>
+          </w:rPr>
+          <w:id w:val="1670751559"/>
+          <w:citation/>
+        </w:sdtPr>
+        <w:sdtContent>
+          <w:r>
+            <w:rPr>
+              <w:lang w:val="en-US"/>
+            </w:rPr>
+            <w:fldChar w:fldCharType="begin"/>
+          </w:r>
+          <w:r>
+            <w:rPr>
+              <w:lang w:val="en-US"/>
+            </w:rPr>
+            <w:instrText xml:space="preserve"> CITATION Gon09 \l 1044 </w:instrText>
+          </w:r>
+          <w:r>
+            <w:rPr>
+              <w:lang w:val="en-US"/>
+            </w:rPr>
+            <w:fldChar w:fldCharType="separate"/>
+          </w:r>
+          <w:r>
+            <w:rPr>
+              <w:noProof/>
+              <w:lang w:val="en-US"/>
+            </w:rPr>
+            <w:t>(Gonzalez , Woods, &amp; Eddins, 2009)</w:t>
+          </w:r>
+          <w:r>
+            <w:rPr>
+              <w:lang w:val="en-US"/>
+            </w:rPr>
+            <w:fldChar w:fldCharType="end"/>
+          </w:r>
+        </w:sdtContent>
+      </w:sdt>
+      <w:r>
+        <w:rPr>
+          <w:lang w:val="en-US"/>
+        </w:rPr>
+        <w:t xml:space="preserve"> chapter 11.3.5 an algorithm that uses edges to improve global thresholding is presented. This algorithm first computes the edges in an image. During this Master thesis Sobel and Scharr edge detection masks have been used. After obtaining the edge image the edge image is thresholded using a threshold value. This threshold value is found by using a percentile function which thresholds the edge image so that the given percentile edge pixels are kept.</w:t>
+      </w:r>
+      <w:r>
+        <w:rPr>
+          <w:lang w:val="en-US"/>
+        </w:rPr>
+        <w:t xml:space="preserve"> Now we have a binary image where the ones are the strong edges. Now the binary image is laid on the original image and a histogram is calculated using only the pixels in the original image corresponding to ones in the binary image. Lastly this histogram is segmented using Otsu’s method</w:t>
+      </w:r>
+      <w:r>
+        <w:rPr>
+          <w:lang w:val="en-US"/>
+        </w:rPr>
+        <w:t>.</w:t>
+      </w:r>
+    </w:p>
+    <w:p>
+      <w:pPr>
+        <w:rPr>
+          <w:lang w:val="en-US"/>
+        </w:rPr>
+      </w:pPr>
+      <w:r>
+        <w:rPr>
+          <w:lang w:val="en-US"/>
+        </w:rPr>
+        <w:t>During the project this algorithm have been implemented both as stated above and also with the option of not calculating the last histogram and doing the thresholding. The algorithm then uses the strong edge binary image as the thresholded image.</w:t>
+      </w:r>
+      <w:r>
+        <w:rPr>
+          <w:lang w:val="en-US"/>
+        </w:rPr>
+        <w:t xml:space="preserve"> This uses less computing time and combined with Gaussian smoothing it may perform adequately. </w:t>
+      </w:r>
+      <w:bookmarkStart w:id="42" w:name="_GoBack"/>
       <w:bookmarkEnd w:id="42"/>
-    </w:p>
-    <w:p>
-      <w:pPr>
-        <w:rPr>
-          <w:lang w:val="en-US"/>
-        </w:rPr>
-      </w:pPr>
+      <w:r>
+        <w:rPr>
+          <w:lang w:val="en-US"/>
+        </w:rPr>
+        <w:t xml:space="preserve"> </w:t>
+      </w:r>
+      <w:r>
+        <w:rPr>
+          <w:lang w:val="en-US"/>
+        </w:rPr>
+        <w:t xml:space="preserve">  </w:t>
+      </w:r>
+      <w:r>
+        <w:rPr>
+          <w:lang w:val="en-US"/>
+        </w:rPr>
+        <w:t xml:space="preserve"> </w:t>
+      </w:r>
     </w:p>
     <w:p>
       <w:pPr>
@@ -18299,6 +18353,7 @@
         <w:ind w:left="720" w:hanging="720"/>
         <w:rPr>
           <w:noProof/>
+          <w:lang w:val="en-US"/>
         </w:rPr>
       </w:pPr>
       <w:r>
@@ -18327,6 +18382,7 @@
       <w:r>
         <w:rPr>
           <w:noProof/>
+          <w:lang w:val="en-US"/>
         </w:rPr>
         <w:t>Scottish Aquaculture Research Forum.</w:t>
       </w:r>
@@ -19345,9 +19401,6 @@
     <w:p>
       <w:pPr>
         <w:pStyle w:val="CommentText"/>
-        <w:rPr>
-          <w:lang w:val="en-US"/>
-        </w:rPr>
       </w:pPr>
       <w:r>
         <w:rPr>
@@ -19355,23 +19408,12 @@
         </w:rPr>
         <w:annotationRef/>
       </w:r>
-      <w:proofErr w:type="spellStart"/>
-      <w:r>
-        <w:rPr>
-          <w:lang w:val="en-US"/>
-        </w:rPr>
-        <w:t>Mer</w:t>
-      </w:r>
-      <w:proofErr w:type="spellEnd"/>
-      <w:r>
-        <w:rPr>
-          <w:lang w:val="en-US"/>
-        </w:rPr>
-        <w:t xml:space="preserve"> her</w:t>
+      <w:r>
+        <w:t>Mer her</w:t>
       </w:r>
     </w:p>
   </w:comment>
-  <w:comment w:id="40" w:author="Windows User" w:date="2013-03-25T12:22:00Z" w:initials="WU">
+  <w:comment w:id="39" w:author="Windows User" w:date="2013-03-25T12:22:00Z" w:initials="WU">
     <w:p>
       <w:pPr>
         <w:pStyle w:val="CommentText"/>
@@ -22233,555 +22275,6 @@
 </w:styles>
 </file>
 
-<file path=word/glossary/document.xml><?xml version="1.0" encoding="utf-8"?>
-<w:glossaryDocument xmlns:wpc="http://schemas.microsoft.com/office/word/2010/wordprocessingCanvas" xmlns:mc="http://schemas.openxmlformats.org/markup-compatibility/2006" xmlns:o="urn:schemas-microsoft-com:office:office" xmlns:r="http://schemas.openxmlformats.org/officeDocument/2006/relationships" xmlns:m="http://schemas.openxmlformats.org/officeDocument/2006/math" xmlns:v="urn:schemas-microsoft-com:vml" xmlns:wp14="http://schemas.microsoft.com/office/word/2010/wordprocessingDrawing" xmlns:wp="http://schemas.openxmlformats.org/drawingml/2006/wordprocessingDrawing" xmlns:w10="urn:schemas-microsoft-com:office:word" xmlns:w="http://schemas.openxmlformats.org/wordprocessingml/2006/main" xmlns:w14="http://schemas.microsoft.com/office/word/2010/wordml" xmlns:wpg="http://schemas.microsoft.com/office/word/2010/wordprocessingGroup" xmlns:wpi="http://schemas.microsoft.com/office/word/2010/wordprocessingInk" xmlns:wne="http://schemas.microsoft.com/office/word/2006/wordml" xmlns:wps="http://schemas.microsoft.com/office/word/2010/wordprocessingShape" mc:Ignorable="w14 wp14"/>
-</file>
-
-<file path=word/glossary/fontTable.xml><?xml version="1.0" encoding="utf-8"?>
-<w:fonts xmlns:mc="http://schemas.openxmlformats.org/markup-compatibility/2006" xmlns:r="http://schemas.openxmlformats.org/officeDocument/2006/relationships" xmlns:w="http://schemas.openxmlformats.org/wordprocessingml/2006/main" xmlns:w14="http://schemas.microsoft.com/office/word/2010/wordml" mc:Ignorable="w14">
-  <w:font w:name="Symbol">
-    <w:panose1 w:val="05050102010706020507"/>
-    <w:charset w:val="02"/>
-    <w:family w:val="roman"/>
-    <w:pitch w:val="variable"/>
-    <w:sig w:usb0="00000000" w:usb1="10000000" w:usb2="00000000" w:usb3="00000000" w:csb0="80000000" w:csb1="00000000"/>
-  </w:font>
-  <w:font w:name="Times New Roman">
-    <w:panose1 w:val="02020603050405020304"/>
-    <w:charset w:val="00"/>
-    <w:family w:val="roman"/>
-    <w:pitch w:val="variable"/>
-    <w:sig w:usb0="E0002AFF" w:usb1="C0007841" w:usb2="00000009" w:usb3="00000000" w:csb0="000001FF" w:csb1="00000000"/>
-  </w:font>
-  <w:font w:name="Courier New">
-    <w:panose1 w:val="02070309020205020404"/>
-    <w:charset w:val="00"/>
-    <w:family w:val="modern"/>
-    <w:pitch w:val="fixed"/>
-    <w:sig w:usb0="E0002AFF" w:usb1="C0007843" w:usb2="00000009" w:usb3="00000000" w:csb0="000001FF" w:csb1="00000000"/>
-  </w:font>
-  <w:font w:name="Wingdings">
-    <w:panose1 w:val="05000000000000000000"/>
-    <w:charset w:val="02"/>
-    <w:family w:val="auto"/>
-    <w:pitch w:val="variable"/>
-    <w:sig w:usb0="00000000" w:usb1="10000000" w:usb2="00000000" w:usb3="00000000" w:csb0="80000000" w:csb1="00000000"/>
-  </w:font>
-  <w:font w:name="Calibri">
-    <w:panose1 w:val="020F0502020204030204"/>
-    <w:charset w:val="00"/>
-    <w:family w:val="swiss"/>
-    <w:pitch w:val="variable"/>
-    <w:sig w:usb0="E00002FF" w:usb1="4000ACFF" w:usb2="00000001" w:usb3="00000000" w:csb0="0000019F" w:csb1="00000000"/>
-  </w:font>
-  <w:font w:name="Cambria">
-    <w:panose1 w:val="02040503050406030204"/>
-    <w:charset w:val="00"/>
-    <w:family w:val="roman"/>
-    <w:pitch w:val="variable"/>
-    <w:sig w:usb0="E00002FF" w:usb1="400004FF" w:usb2="00000000" w:usb3="00000000" w:csb0="0000019F" w:csb1="00000000"/>
-  </w:font>
-  <w:font w:name="Tahoma">
-    <w:panose1 w:val="020B0604030504040204"/>
-    <w:charset w:val="00"/>
-    <w:family w:val="swiss"/>
-    <w:pitch w:val="variable"/>
-    <w:sig w:usb0="E1002EFF" w:usb1="C000605B" w:usb2="00000029" w:usb3="00000000" w:csb0="000101FF" w:csb1="00000000"/>
-  </w:font>
-  <w:font w:name="Times">
-    <w:panose1 w:val="02020603050405020304"/>
-    <w:charset w:val="00"/>
-    <w:family w:val="roman"/>
-    <w:pitch w:val="variable"/>
-    <w:sig w:usb0="E0002AFF" w:usb1="C0007841" w:usb2="00000009" w:usb3="00000000" w:csb0="000001FF" w:csb1="00000000"/>
-  </w:font>
-  <w:font w:name="Arial">
-    <w:panose1 w:val="020B0604020202020204"/>
-    <w:charset w:val="00"/>
-    <w:family w:val="swiss"/>
-    <w:pitch w:val="variable"/>
-    <w:sig w:usb0="E0002AFF" w:usb1="C0007843" w:usb2="00000009" w:usb3="00000000" w:csb0="000001FF" w:csb1="00000000"/>
-  </w:font>
-  <w:font w:name="Cambria Math">
-    <w:panose1 w:val="02040503050406030204"/>
-    <w:charset w:val="00"/>
-    <w:family w:val="roman"/>
-    <w:pitch w:val="variable"/>
-    <w:sig w:usb0="E00002FF" w:usb1="420024FF" w:usb2="00000000" w:usb3="00000000" w:csb0="0000019F" w:csb1="00000000"/>
-  </w:font>
-  <w:font w:name="Univers-Medium">
-    <w:panose1 w:val="00000000000000000000"/>
-    <w:charset w:val="00"/>
-    <w:family w:val="swiss"/>
-    <w:notTrueType/>
-    <w:pitch w:val="default"/>
-    <w:sig w:usb0="00000003" w:usb1="00000000" w:usb2="00000000" w:usb3="00000000" w:csb0="00000001" w:csb1="00000000"/>
-  </w:font>
-  <w:font w:name="Univers-MediumItalic">
-    <w:panose1 w:val="00000000000000000000"/>
-    <w:charset w:val="00"/>
-    <w:family w:val="swiss"/>
-    <w:notTrueType/>
-    <w:pitch w:val="default"/>
-    <w:sig w:usb0="00000003" w:usb1="00000000" w:usb2="00000000" w:usb3="00000000" w:csb0="00000001" w:csb1="00000000"/>
-  </w:font>
-  <w:font w:name="Univers_-Bold">
-    <w:panose1 w:val="00000000000000000000"/>
-    <w:charset w:val="00"/>
-    <w:family w:val="swiss"/>
-    <w:notTrueType/>
-    <w:pitch w:val="default"/>
-    <w:sig w:usb0="00000003" w:usb1="00000000" w:usb2="00000000" w:usb3="00000000" w:csb0="00000001" w:csb1="00000000"/>
-  </w:font>
-</w:fonts>
-</file>
-
-<file path=word/glossary/settings.xml><?xml version="1.0" encoding="utf-8"?>
-<w:settings xmlns:mc="http://schemas.openxmlformats.org/markup-compatibility/2006" xmlns:o="urn:schemas-microsoft-com:office:office" xmlns:r="http://schemas.openxmlformats.org/officeDocument/2006/relationships" xmlns:m="http://schemas.openxmlformats.org/officeDocument/2006/math" xmlns:v="urn:schemas-microsoft-com:vml" xmlns:w10="urn:schemas-microsoft-com:office:word" xmlns:w="http://schemas.openxmlformats.org/wordprocessingml/2006/main" xmlns:w14="http://schemas.microsoft.com/office/word/2010/wordml" xmlns:sl="http://schemas.openxmlformats.org/schemaLibrary/2006/main" mc:Ignorable="w14">
-  <w:view w:val="normal"/>
-  <w:revisionView w:comments="0" w:inkAnnotations="0"/>
-  <w:defaultTabStop w:val="708"/>
-  <w:hyphenationZone w:val="425"/>
-  <w:characterSpacingControl w:val="doNotCompress"/>
-  <w:compat>
-    <w:useFELayout/>
-    <w:compatSetting w:name="compatibilityMode" w:uri="http://schemas.microsoft.com/office/word" w:val="14"/>
-    <w:compatSetting w:name="overrideTableStyleFontSizeAndJustification" w:uri="http://schemas.microsoft.com/office/word" w:val="1"/>
-    <w:compatSetting w:name="enableOpenTypeFeatures" w:uri="http://schemas.microsoft.com/office/word" w:val="1"/>
-    <w:compatSetting w:name="doNotFlipMirrorIndents" w:uri="http://schemas.microsoft.com/office/word" w:val="1"/>
-  </w:compat>
-  <w:rsids>
-    <w:rsidRoot w:val="00B22B90"/>
-    <w:rsid w:val="00B22B90"/>
-    <w:rsid w:val="00E4706B"/>
-  </w:rsids>
-  <m:mathPr>
-    <m:mathFont m:val="Cambria Math"/>
-    <m:brkBin m:val="before"/>
-    <m:brkBinSub m:val="--"/>
-    <m:smallFrac m:val="0"/>
-    <m:dispDef/>
-    <m:lMargin m:val="0"/>
-    <m:rMargin m:val="0"/>
-    <m:defJc m:val="centerGroup"/>
-    <m:wrapIndent m:val="1440"/>
-    <m:intLim m:val="subSup"/>
-    <m:naryLim m:val="undOvr"/>
-  </m:mathPr>
-  <w:themeFontLang w:val="nb-NO"/>
-  <w:clrSchemeMapping w:bg1="light1" w:t1="dark1" w:bg2="light2" w:t2="dark2" w:accent1="accent1" w:accent2="accent2" w:accent3="accent3" w:accent4="accent4" w:accent5="accent5" w:accent6="accent6" w:hyperlink="hyperlink" w:followedHyperlink="followedHyperlink"/>
-  <w:decimalSymbol w:val=","/>
-  <w:listSeparator w:val=";"/>
-</w:settings>
-</file>
-
-<file path=word/glossary/styles.xml><?xml version="1.0" encoding="utf-8"?>
-<w:styles xmlns:mc="http://schemas.openxmlformats.org/markup-compatibility/2006" xmlns:r="http://schemas.openxmlformats.org/officeDocument/2006/relationships" xmlns:w="http://schemas.openxmlformats.org/wordprocessingml/2006/main" xmlns:w14="http://schemas.microsoft.com/office/word/2010/wordml" mc:Ignorable="w14">
-  <w:docDefaults>
-    <w:rPrDefault>
-      <w:rPr>
-        <w:rFonts w:asciiTheme="minorHAnsi" w:eastAsiaTheme="minorEastAsia" w:hAnsiTheme="minorHAnsi" w:cstheme="minorBidi"/>
-        <w:sz w:val="22"/>
-        <w:szCs w:val="22"/>
-        <w:lang w:val="nb-NO" w:eastAsia="nb-NO" w:bidi="ar-SA"/>
-      </w:rPr>
-    </w:rPrDefault>
-    <w:pPrDefault>
-      <w:pPr>
-        <w:spacing w:after="200" w:line="276" w:lineRule="auto"/>
-      </w:pPr>
-    </w:pPrDefault>
-  </w:docDefaults>
-  <w:latentStyles w:defLockedState="0" w:defUIPriority="99" w:defSemiHidden="1" w:defUnhideWhenUsed="1" w:defQFormat="0" w:count="267">
-    <w:lsdException w:name="Normal" w:semiHidden="0" w:uiPriority="0" w:unhideWhenUsed="0" w:qFormat="1"/>
-    <w:lsdException w:name="heading 1" w:semiHidden="0" w:uiPriority="9" w:unhideWhenUsed="0" w:qFormat="1"/>
-    <w:lsdException w:name="heading 2" w:uiPriority="9" w:qFormat="1"/>
-    <w:lsdException w:name="heading 3" w:uiPriority="9" w:qFormat="1"/>
-    <w:lsdException w:name="heading 4" w:uiPriority="9" w:qFormat="1"/>
-    <w:lsdException w:name="heading 5" w:uiPriority="9" w:qFormat="1"/>
-    <w:lsdException w:name="heading 6" w:uiPriority="9" w:qFormat="1"/>
-    <w:lsdException w:name="heading 7" w:uiPriority="9" w:qFormat="1"/>
-    <w:lsdException w:name="heading 8" w:uiPriority="9" w:qFormat="1"/>
-    <w:lsdException w:name="heading 9" w:uiPriority="9" w:qFormat="1"/>
-    <w:lsdException w:name="toc 1" w:uiPriority="39"/>
-    <w:lsdException w:name="toc 2" w:uiPriority="39"/>
-    <w:lsdException w:name="toc 3" w:uiPriority="39"/>
-    <w:lsdException w:name="toc 4" w:uiPriority="39"/>
-    <w:lsdException w:name="toc 5" w:uiPriority="39"/>
-    <w:lsdException w:name="toc 6" w:uiPriority="39"/>
-    <w:lsdException w:name="toc 7" w:uiPriority="39"/>
-    <w:lsdException w:name="toc 8" w:uiPriority="39"/>
-    <w:lsdException w:name="toc 9" w:uiPriority="39"/>
-    <w:lsdException w:name="caption" w:uiPriority="35" w:qFormat="1"/>
-    <w:lsdException w:name="Title" w:semiHidden="0" w:uiPriority="10" w:unhideWhenUsed="0" w:qFormat="1"/>
-    <w:lsdException w:name="Default Paragraph Font" w:uiPriority="1"/>
-    <w:lsdException w:name="Subtitle" w:semiHidden="0" w:uiPriority="11" w:unhideWhenUsed="0" w:qFormat="1"/>
-    <w:lsdException w:name="Strong" w:semiHidden="0" w:uiPriority="22" w:unhideWhenUsed="0" w:qFormat="1"/>
-    <w:lsdException w:name="Emphasis" w:semiHidden="0" w:uiPriority="20" w:unhideWhenUsed="0" w:qFormat="1"/>
-    <w:lsdException w:name="Table Grid" w:semiHidden="0" w:uiPriority="59" w:unhideWhenUsed="0"/>
-    <w:lsdException w:name="Placeholder Text" w:unhideWhenUsed="0"/>
-    <w:lsdException w:name="No Spacing" w:semiHidden="0" w:uiPriority="1" w:unhideWhenUsed="0" w:qFormat="1"/>
-    <w:lsdException w:name="Light Shading" w:semiHidden="0" w:uiPriority="60" w:unhideWhenUsed="0"/>
-    <w:lsdException w:name="Light List" w:semiHidden="0" w:uiPriority="61" w:unhideWhenUsed="0"/>
-    <w:lsdException w:name="Light Grid" w:semiHidden="0" w:uiPriority="62" w:unhideWhenUsed="0"/>
-    <w:lsdException w:name="Medium Shading 1" w:semiHidden="0" w:uiPriority="63" w:unhideWhenUsed="0"/>
-    <w:lsdException w:name="Medium Shading 2" w:semiHidden="0" w:uiPriority="64" w:unhideWhenUsed="0"/>
-    <w:lsdException w:name="Medium List 1" w:semiHidden="0" w:uiPriority="65" w:unhideWhenUsed="0"/>
-    <w:lsdException w:name="Medium List 2" w:semiHidden="0" w:uiPriority="66" w:unhideWhenUsed="0"/>
-    <w:lsdException w:name="Medium Grid 1" w:semiHidden="0" w:uiPriority="67" w:unhideWhenUsed="0"/>
-    <w:lsdException w:name="Medium Grid 2" w:semiHidden="0" w:uiPriority="68" w:unhideWhenUsed="0"/>
-    <w:lsdException w:name="Medium Grid 3" w:semiHidden="0" w:uiPriority="69" w:unhideWhenUsed="0"/>
-    <w:lsdException w:name="Dark List" w:semiHidden="0" w:uiPriority="70" w:unhideWhenUsed="0"/>
-    <w:lsdException w:name="Colorful Shading" w:semiHidden="0" w:uiPriority="71" w:unhideWhenUsed="0"/>
-    <w:lsdException w:name="Colorful List" w:semiHidden="0" w:uiPriority="72" w:unhideWhenUsed="0"/>
-    <w:lsdException w:name="Colorful Grid" w:semiHidden="0" w:uiPriority="73" w:unhideWhenUsed="0"/>
-    <w:lsdException w:name="Light Shading Accent 1" w:semiHidden="0" w:uiPriority="60" w:unhideWhenUsed="0"/>
-    <w:lsdException w:name="Light List Accent 1" w:semiHidden="0" w:uiPriority="61" w:unhideWhenUsed="0"/>
-    <w:lsdException w:name="Light Grid Accent 1" w:semiHidden="0" w:uiPriority="62" w:unhideWhenUsed="0"/>
-    <w:lsdException w:name="Medium Shading 1 Accent 1" w:semiHidden="0" w:uiPriority="63" w:unhideWhenUsed="0"/>
-    <w:lsdException w:name="Medium Shading 2 Accent 1" w:semiHidden="0" w:uiPriority="64" w:unhideWhenUsed="0"/>
-    <w:lsdException w:name="Medium List 1 Accent 1" w:semiHidden="0" w:uiPriority="65" w:unhideWhenUsed="0"/>
-    <w:lsdException w:name="Revision" w:unhideWhenUsed="0"/>
-    <w:lsdException w:name="List Paragraph" w:semiHidden="0" w:uiPriority="34" w:unhideWhenUsed="0" w:qFormat="1"/>
-    <w:lsdException w:name="Quote" w:semiHidden="0" w:uiPriority="29" w:unhideWhenUsed="0" w:qFormat="1"/>
-    <w:lsdException w:name="Intense Quote" w:semiHidden="0" w:uiPriority="30" w:unhideWhenUsed="0" w:qFormat="1"/>
-    <w:lsdException w:name="Medium List 2 Accent 1" w:semiHidden="0" w:uiPriority="66" w:unhideWhenUsed="0"/>
-    <w:lsdException w:name="Medium Grid 1 Accent 1" w:semiHidden="0" w:uiPriority="67" w:unhideWhenUsed="0"/>
-    <w:lsdException w:name="Medium Grid 2 Accent 1" w:semiHidden="0" w:uiPriority="68" w:unhideWhenUsed="0"/>
-    <w:lsdException w:name="Medium Grid 3 Accent 1" w:semiHidden="0" w:uiPriority="69" w:unhideWhenUsed="0"/>
-    <w:lsdException w:name="Dark List Accent 1" w:semiHidden="0" w:uiPriority="70" w:unhideWhenUsed="0"/>
-    <w:lsdException w:name="Colorful Shading Accent 1" w:semiHidden="0" w:uiPriority="71" w:unhideWhenUsed="0"/>
-    <w:lsdException w:name="Colorful List Accent 1" w:semiHidden="0" w:uiPriority="72" w:unhideWhenUsed="0"/>
-    <w:lsdException w:name="Colorful Grid Accent 1" w:semiHidden="0" w:uiPriority="73" w:unhideWhenUsed="0"/>
-    <w:lsdException w:name="Light Shading Accent 2" w:semiHidden="0" w:uiPriority="60" w:unhideWhenUsed="0"/>
-    <w:lsdException w:name="Light List Accent 2" w:semiHidden="0" w:uiPriority="61" w:unhideWhenUsed="0"/>
-    <w:lsdException w:name="Light Grid Accent 2" w:semiHidden="0" w:uiPriority="62" w:unhideWhenUsed="0"/>
-    <w:lsdException w:name="Medium Shading 1 Accent 2" w:semiHidden="0" w:uiPriority="63" w:unhideWhenUsed="0"/>
-    <w:lsdException w:name="Medium Shading 2 Accent 2" w:semiHidden="0" w:uiPriority="64" w:unhideWhenUsed="0"/>
-    <w:lsdException w:name="Medium List 1 Accent 2" w:semiHidden="0" w:uiPriority="65" w:unhideWhenUsed="0"/>
-    <w:lsdException w:name="Medium List 2 Accent 2" w:semiHidden="0" w:uiPriority="66" w:unhideWhenUsed="0"/>
-    <w:lsdException w:name="Medium Grid 1 Accent 2" w:semiHidden="0" w:uiPriority="67" w:unhideWhenUsed="0"/>
-    <w:lsdException w:name="Medium Grid 2 Accent 2" w:semiHidden="0" w:uiPriority="68" w:unhideWhenUsed="0"/>
-    <w:lsdException w:name="Medium Grid 3 Accent 2" w:semiHidden="0" w:uiPriority="69" w:unhideWhenUsed="0"/>
-    <w:lsdException w:name="Dark List Accent 2" w:semiHidden="0" w:uiPriority="70" w:unhideWhenUsed="0"/>
-    <w:lsdException w:name="Colorful Shading Accent 2" w:semiHidden="0" w:uiPriority="71" w:unhideWhenUsed="0"/>
-    <w:lsdException w:name="Colorful List Accent 2" w:semiHidden="0" w:uiPriority="72" w:unhideWhenUsed="0"/>
-    <w:lsdException w:name="Colorful Grid Accent 2" w:semiHidden="0" w:uiPriority="73" w:unhideWhenUsed="0"/>
-    <w:lsdException w:name="Light Shading Accent 3" w:semiHidden="0" w:uiPriority="60" w:unhideWhenUsed="0"/>
-    <w:lsdException w:name="Light List Accent 3" w:semiHidden="0" w:uiPriority="61" w:unhideWhenUsed="0"/>
-    <w:lsdException w:name="Light Grid Accent 3" w:semiHidden="0" w:uiPriority="62" w:unhideWhenUsed="0"/>
-    <w:lsdException w:name="Medium Shading 1 Accent 3" w:semiHidden="0" w:uiPriority="63" w:unhideWhenUsed="0"/>
-    <w:lsdException w:name="Medium Shading 2 Accent 3" w:semiHidden="0" w:uiPriority="64" w:unhideWhenUsed="0"/>
-    <w:lsdException w:name="Medium List 1 Accent 3" w:semiHidden="0" w:uiPriority="65" w:unhideWhenUsed="0"/>
-    <w:lsdException w:name="Medium List 2 Accent 3" w:semiHidden="0" w:uiPriority="66" w:unhideWhenUsed="0"/>
-    <w:lsdException w:name="Medium Grid 1 Accent 3" w:semiHidden="0" w:uiPriority="67" w:unhideWhenUsed="0"/>
-    <w:lsdException w:name="Medium Grid 2 Accent 3" w:semiHidden="0" w:uiPriority="68" w:unhideWhenUsed="0"/>
-    <w:lsdException w:name="Medium Grid 3 Accent 3" w:semiHidden="0" w:uiPriority="69" w:unhideWhenUsed="0"/>
-    <w:lsdException w:name="Dark List Accent 3" w:semiHidden="0" w:uiPriority="70" w:unhideWhenUsed="0"/>
-    <w:lsdException w:name="Colorful Shading Accent 3" w:semiHidden="0" w:uiPriority="71" w:unhideWhenUsed="0"/>
-    <w:lsdException w:name="Colorful List Accent 3" w:semiHidden="0" w:uiPriority="72" w:unhideWhenUsed="0"/>
-    <w:lsdException w:name="Colorful Grid Accent 3" w:semiHidden="0" w:uiPriority="73" w:unhideWhenUsed="0"/>
-    <w:lsdException w:name="Light Shading Accent 4" w:semiHidden="0" w:uiPriority="60" w:unhideWhenUsed="0"/>
-    <w:lsdException w:name="Light List Accent 4" w:semiHidden="0" w:uiPriority="61" w:unhideWhenUsed="0"/>
-    <w:lsdException w:name="Light Grid Accent 4" w:semiHidden="0" w:uiPriority="62" w:unhideWhenUsed="0"/>
-    <w:lsdException w:name="Medium Shading 1 Accent 4" w:semiHidden="0" w:uiPriority="63" w:unhideWhenUsed="0"/>
-    <w:lsdException w:name="Medium Shading 2 Accent 4" w:semiHidden="0" w:uiPriority="64" w:unhideWhenUsed="0"/>
-    <w:lsdException w:name="Medium List 1 Accent 4" w:semiHidden="0" w:uiPriority="65" w:unhideWhenUsed="0"/>
-    <w:lsdException w:name="Medium List 2 Accent 4" w:semiHidden="0" w:uiPriority="66" w:unhideWhenUsed="0"/>
-    <w:lsdException w:name="Medium Grid 1 Accent 4" w:semiHidden="0" w:uiPriority="67" w:unhideWhenUsed="0"/>
-    <w:lsdException w:name="Medium Grid 2 Accent 4" w:semiHidden="0" w:uiPriority="68" w:unhideWhenUsed="0"/>
-    <w:lsdException w:name="Medium Grid 3 Accent 4" w:semiHidden="0" w:uiPriority="69" w:unhideWhenUsed="0"/>
-    <w:lsdException w:name="Dark List Accent 4" w:semiHidden="0" w:uiPriority="70" w:unhideWhenUsed="0"/>
-    <w:lsdException w:name="Colorful Shading Accent 4" w:semiHidden="0" w:uiPriority="71" w:unhideWhenUsed="0"/>
-    <w:lsdException w:name="Colorful List Accent 4" w:semiHidden="0" w:uiPriority="72" w:unhideWhenUsed="0"/>
-    <w:lsdException w:name="Colorful Grid Accent 4" w:semiHidden="0" w:uiPriority="73" w:unhideWhenUsed="0"/>
-    <w:lsdException w:name="Light Shading Accent 5" w:semiHidden="0" w:uiPriority="60" w:unhideWhenUsed="0"/>
-    <w:lsdException w:name="Light List Accent 5" w:semiHidden="0" w:uiPriority="61" w:unhideWhenUsed="0"/>
-    <w:lsdException w:name="Light Grid Accent 5" w:semiHidden="0" w:uiPriority="62" w:unhideWhenUsed="0"/>
-    <w:lsdException w:name="Medium Shading 1 Accent 5" w:semiHidden="0" w:uiPriority="63" w:unhideWhenUsed="0"/>
-    <w:lsdException w:name="Medium Shading 2 Accent 5" w:semiHidden="0" w:uiPriority="64" w:unhideWhenUsed="0"/>
-    <w:lsdException w:name="Medium List 1 Accent 5" w:semiHidden="0" w:uiPriority="65" w:unhideWhenUsed="0"/>
-    <w:lsdException w:name="Medium List 2 Accent 5" w:semiHidden="0" w:uiPriority="66" w:unhideWhenUsed="0"/>
-    <w:lsdException w:name="Medium Grid 1 Accent 5" w:semiHidden="0" w:uiPriority="67" w:unhideWhenUsed="0"/>
-    <w:lsdException w:name="Medium Grid 2 Accent 5" w:semiHidden="0" w:uiPriority="68" w:unhideWhenUsed="0"/>
-    <w:lsdException w:name="Medium Grid 3 Accent 5" w:semiHidden="0" w:uiPriority="69" w:unhideWhenUsed="0"/>
-    <w:lsdException w:name="Dark List Accent 5" w:semiHidden="0" w:uiPriority="70" w:unhideWhenUsed="0"/>
-    <w:lsdException w:name="Colorful Shading Accent 5" w:semiHidden="0" w:uiPriority="71" w:unhideWhenUsed="0"/>
-    <w:lsdException w:name="Colorful List Accent 5" w:semiHidden="0" w:uiPriority="72" w:unhideWhenUsed="0"/>
-    <w:lsdException w:name="Colorful Grid Accent 5" w:semiHidden="0" w:uiPriority="73" w:unhideWhenUsed="0"/>
-    <w:lsdException w:name="Light Shading Accent 6" w:semiHidden="0" w:uiPriority="60" w:unhideWhenUsed="0"/>
-    <w:lsdException w:name="Light List Accent 6" w:semiHidden="0" w:uiPriority="61" w:unhideWhenUsed="0"/>
-    <w:lsdException w:name="Light Grid Accent 6" w:semiHidden="0" w:uiPriority="62" w:unhideWhenUsed="0"/>
-    <w:lsdException w:name="Medium Shading 1 Accent 6" w:semiHidden="0" w:uiPriority="63" w:unhideWhenUsed="0"/>
-    <w:lsdException w:name="Medium Shading 2 Accent 6" w:semiHidden="0" w:uiPriority="64" w:unhideWhenUsed="0"/>
-    <w:lsdException w:name="Medium List 1 Accent 6" w:semiHidden="0" w:uiPriority="65" w:unhideWhenUsed="0"/>
-    <w:lsdException w:name="Medium List 2 Accent 6" w:semiHidden="0" w:uiPriority="66" w:unhideWhenUsed="0"/>
-    <w:lsdException w:name="Medium Grid 1 Accent 6" w:semiHidden="0" w:uiPriority="67" w:unhideWhenUsed="0"/>
-    <w:lsdException w:name="Medium Grid 2 Accent 6" w:semiHidden="0" w:uiPriority="68" w:unhideWhenUsed="0"/>
-    <w:lsdException w:name="Medium Grid 3 Accent 6" w:semiHidden="0" w:uiPriority="69" w:unhideWhenUsed="0"/>
-    <w:lsdException w:name="Dark List Accent 6" w:semiHidden="0" w:uiPriority="70" w:unhideWhenUsed="0"/>
-    <w:lsdException w:name="Colorful Shading Accent 6" w:semiHidden="0" w:uiPriority="71" w:unhideWhenUsed="0"/>
-    <w:lsdException w:name="Colorful List Accent 6" w:semiHidden="0" w:uiPriority="72" w:unhideWhenUsed="0"/>
-    <w:lsdException w:name="Colorful Grid Accent 6" w:semiHidden="0" w:uiPriority="73" w:unhideWhenUsed="0"/>
-    <w:lsdException w:name="Subtle Emphasis" w:semiHidden="0" w:uiPriority="19" w:unhideWhenUsed="0" w:qFormat="1"/>
-    <w:lsdException w:name="Intense Emphasis" w:semiHidden="0" w:uiPriority="21" w:unhideWhenUsed="0" w:qFormat="1"/>
-    <w:lsdException w:name="Subtle Reference" w:semiHidden="0" w:uiPriority="31" w:unhideWhenUsed="0" w:qFormat="1"/>
-    <w:lsdException w:name="Intense Reference" w:semiHidden="0" w:uiPriority="32" w:unhideWhenUsed="0" w:qFormat="1"/>
-    <w:lsdException w:name="Book Title" w:semiHidden="0" w:uiPriority="33" w:unhideWhenUsed="0" w:qFormat="1"/>
-    <w:lsdException w:name="Bibliography" w:uiPriority="37"/>
-    <w:lsdException w:name="TOC Heading" w:uiPriority="39" w:qFormat="1"/>
-  </w:latentStyles>
-  <w:style w:type="paragraph" w:default="1" w:styleId="Normal">
-    <w:name w:val="Normal"/>
-    <w:qFormat/>
-  </w:style>
-  <w:style w:type="character" w:default="1" w:styleId="DefaultParagraphFont">
-    <w:name w:val="Default Paragraph Font"/>
-    <w:uiPriority w:val="1"/>
-    <w:semiHidden/>
-    <w:unhideWhenUsed/>
-  </w:style>
-  <w:style w:type="table" w:default="1" w:styleId="TableNormal">
-    <w:name w:val="Normal Table"/>
-    <w:uiPriority w:val="99"/>
-    <w:semiHidden/>
-    <w:unhideWhenUsed/>
-    <w:tblPr>
-      <w:tblInd w:w="0" w:type="dxa"/>
-      <w:tblCellMar>
-        <w:top w:w="0" w:type="dxa"/>
-        <w:left w:w="108" w:type="dxa"/>
-        <w:bottom w:w="0" w:type="dxa"/>
-        <w:right w:w="108" w:type="dxa"/>
-      </w:tblCellMar>
-    </w:tblPr>
-  </w:style>
-  <w:style w:type="numbering" w:default="1" w:styleId="NoList">
-    <w:name w:val="No List"/>
-    <w:uiPriority w:val="99"/>
-    <w:semiHidden/>
-    <w:unhideWhenUsed/>
-  </w:style>
-  <w:style w:type="character" w:styleId="PlaceholderText">
-    <w:name w:val="Placeholder Text"/>
-    <w:basedOn w:val="DefaultParagraphFont"/>
-    <w:uiPriority w:val="99"/>
-    <w:semiHidden/>
-    <w:rsid w:val="00B22B90"/>
-    <w:rPr>
-      <w:color w:val="808080"/>
-    </w:rPr>
-  </w:style>
-</w:styles>
-</file>
-
-<file path=word/glossary/stylesWithEffects.xml><?xml version="1.0" encoding="utf-8"?>
-<w:styles xmlns:wpc="http://schemas.microsoft.com/office/word/2010/wordprocessingCanvas" xmlns:mc="http://schemas.openxmlformats.org/markup-compatibility/2006" xmlns:o="urn:schemas-microsoft-com:office:office" xmlns:r="http://schemas.openxmlformats.org/officeDocument/2006/relationships" xmlns:m="http://schemas.openxmlformats.org/officeDocument/2006/math" xmlns:v="urn:schemas-microsoft-com:vml" xmlns:wp14="http://schemas.microsoft.com/office/word/2010/wordprocessingDrawing" xmlns:wp="http://schemas.openxmlformats.org/drawingml/2006/wordprocessingDrawing" xmlns:w10="urn:schemas-microsoft-com:office:word" xmlns:w="http://schemas.openxmlformats.org/wordprocessingml/2006/main" xmlns:w14="http://schemas.microsoft.com/office/word/2010/wordml" xmlns:wpg="http://schemas.microsoft.com/office/word/2010/wordprocessingGroup" xmlns:wpi="http://schemas.microsoft.com/office/word/2010/wordprocessingInk" xmlns:wne="http://schemas.microsoft.com/office/word/2006/wordml" xmlns:wps="http://schemas.microsoft.com/office/word/2010/wordprocessingShape" mc:Ignorable="w14 wp14">
-  <w:docDefaults>
-    <w:rPrDefault>
-      <w:rPr>
-        <w:rFonts w:asciiTheme="minorHAnsi" w:eastAsiaTheme="minorEastAsia" w:hAnsiTheme="minorHAnsi" w:cstheme="minorBidi"/>
-        <w:sz w:val="22"/>
-        <w:szCs w:val="22"/>
-        <w:lang w:val="nb-NO" w:eastAsia="nb-NO" w:bidi="ar-SA"/>
-      </w:rPr>
-    </w:rPrDefault>
-    <w:pPrDefault>
-      <w:pPr>
-        <w:spacing w:after="200" w:line="276" w:lineRule="auto"/>
-      </w:pPr>
-    </w:pPrDefault>
-  </w:docDefaults>
-  <w:latentStyles w:defLockedState="0" w:defUIPriority="99" w:defSemiHidden="1" w:defUnhideWhenUsed="1" w:defQFormat="0" w:count="267">
-    <w:lsdException w:name="Normal" w:semiHidden="0" w:uiPriority="0" w:unhideWhenUsed="0" w:qFormat="1"/>
-    <w:lsdException w:name="heading 1" w:semiHidden="0" w:uiPriority="9" w:unhideWhenUsed="0" w:qFormat="1"/>
-    <w:lsdException w:name="heading 2" w:uiPriority="9" w:qFormat="1"/>
-    <w:lsdException w:name="heading 3" w:uiPriority="9" w:qFormat="1"/>
-    <w:lsdException w:name="heading 4" w:uiPriority="9" w:qFormat="1"/>
-    <w:lsdException w:name="heading 5" w:uiPriority="9" w:qFormat="1"/>
-    <w:lsdException w:name="heading 6" w:uiPriority="9" w:qFormat="1"/>
-    <w:lsdException w:name="heading 7" w:uiPriority="9" w:qFormat="1"/>
-    <w:lsdException w:name="heading 8" w:uiPriority="9" w:qFormat="1"/>
-    <w:lsdException w:name="heading 9" w:uiPriority="9" w:qFormat="1"/>
-    <w:lsdException w:name="toc 1" w:uiPriority="39"/>
-    <w:lsdException w:name="toc 2" w:uiPriority="39"/>
-    <w:lsdException w:name="toc 3" w:uiPriority="39"/>
-    <w:lsdException w:name="toc 4" w:uiPriority="39"/>
-    <w:lsdException w:name="toc 5" w:uiPriority="39"/>
-    <w:lsdException w:name="toc 6" w:uiPriority="39"/>
-    <w:lsdException w:name="toc 7" w:uiPriority="39"/>
-    <w:lsdException w:name="toc 8" w:uiPriority="39"/>
-    <w:lsdException w:name="toc 9" w:uiPriority="39"/>
-    <w:lsdException w:name="caption" w:uiPriority="35" w:qFormat="1"/>
-    <w:lsdException w:name="Title" w:semiHidden="0" w:uiPriority="10" w:unhideWhenUsed="0" w:qFormat="1"/>
-    <w:lsdException w:name="Default Paragraph Font" w:uiPriority="1"/>
-    <w:lsdException w:name="Subtitle" w:semiHidden="0" w:uiPriority="11" w:unhideWhenUsed="0" w:qFormat="1"/>
-    <w:lsdException w:name="Strong" w:semiHidden="0" w:uiPriority="22" w:unhideWhenUsed="0" w:qFormat="1"/>
-    <w:lsdException w:name="Emphasis" w:semiHidden="0" w:uiPriority="20" w:unhideWhenUsed="0" w:qFormat="1"/>
-    <w:lsdException w:name="Table Grid" w:semiHidden="0" w:uiPriority="59" w:unhideWhenUsed="0"/>
-    <w:lsdException w:name="Placeholder Text" w:unhideWhenUsed="0"/>
-    <w:lsdException w:name="No Spacing" w:semiHidden="0" w:uiPriority="1" w:unhideWhenUsed="0" w:qFormat="1"/>
-    <w:lsdException w:name="Light Shading" w:semiHidden="0" w:uiPriority="60" w:unhideWhenUsed="0"/>
-    <w:lsdException w:name="Light List" w:semiHidden="0" w:uiPriority="61" w:unhideWhenUsed="0"/>
-    <w:lsdException w:name="Light Grid" w:semiHidden="0" w:uiPriority="62" w:unhideWhenUsed="0"/>
-    <w:lsdException w:name="Medium Shading 1" w:semiHidden="0" w:uiPriority="63" w:unhideWhenUsed="0"/>
-    <w:lsdException w:name="Medium Shading 2" w:semiHidden="0" w:uiPriority="64" w:unhideWhenUsed="0"/>
-    <w:lsdException w:name="Medium List 1" w:semiHidden="0" w:uiPriority="65" w:unhideWhenUsed="0"/>
-    <w:lsdException w:name="Medium List 2" w:semiHidden="0" w:uiPriority="66" w:unhideWhenUsed="0"/>
-    <w:lsdException w:name="Medium Grid 1" w:semiHidden="0" w:uiPriority="67" w:unhideWhenUsed="0"/>
-    <w:lsdException w:name="Medium Grid 2" w:semiHidden="0" w:uiPriority="68" w:unhideWhenUsed="0"/>
-    <w:lsdException w:name="Medium Grid 3" w:semiHidden="0" w:uiPriority="69" w:unhideWhenUsed="0"/>
-    <w:lsdException w:name="Dark List" w:semiHidden="0" w:uiPriority="70" w:unhideWhenUsed="0"/>
-    <w:lsdException w:name="Colorful Shading" w:semiHidden="0" w:uiPriority="71" w:unhideWhenUsed="0"/>
-    <w:lsdException w:name="Colorful List" w:semiHidden="0" w:uiPriority="72" w:unhideWhenUsed="0"/>
-    <w:lsdException w:name="Colorful Grid" w:semiHidden="0" w:uiPriority="73" w:unhideWhenUsed="0"/>
-    <w:lsdException w:name="Light Shading Accent 1" w:semiHidden="0" w:uiPriority="60" w:unhideWhenUsed="0"/>
-    <w:lsdException w:name="Light List Accent 1" w:semiHidden="0" w:uiPriority="61" w:unhideWhenUsed="0"/>
-    <w:lsdException w:name="Light Grid Accent 1" w:semiHidden="0" w:uiPriority="62" w:unhideWhenUsed="0"/>
-    <w:lsdException w:name="Medium Shading 1 Accent 1" w:semiHidden="0" w:uiPriority="63" w:unhideWhenUsed="0"/>
-    <w:lsdException w:name="Medium Shading 2 Accent 1" w:semiHidden="0" w:uiPriority="64" w:unhideWhenUsed="0"/>
-    <w:lsdException w:name="Medium List 1 Accent 1" w:semiHidden="0" w:uiPriority="65" w:unhideWhenUsed="0"/>
-    <w:lsdException w:name="Revision" w:unhideWhenUsed="0"/>
-    <w:lsdException w:name="List Paragraph" w:semiHidden="0" w:uiPriority="34" w:unhideWhenUsed="0" w:qFormat="1"/>
-    <w:lsdException w:name="Quote" w:semiHidden="0" w:uiPriority="29" w:unhideWhenUsed="0" w:qFormat="1"/>
-    <w:lsdException w:name="Intense Quote" w:semiHidden="0" w:uiPriority="30" w:unhideWhenUsed="0" w:qFormat="1"/>
-    <w:lsdException w:name="Medium List 2 Accent 1" w:semiHidden="0" w:uiPriority="66" w:unhideWhenUsed="0"/>
-    <w:lsdException w:name="Medium Grid 1 Accent 1" w:semiHidden="0" w:uiPriority="67" w:unhideWhenUsed="0"/>
-    <w:lsdException w:name="Medium Grid 2 Accent 1" w:semiHidden="0" w:uiPriority="68" w:unhideWhenUsed="0"/>
-    <w:lsdException w:name="Medium Grid 3 Accent 1" w:semiHidden="0" w:uiPriority="69" w:unhideWhenUsed="0"/>
-    <w:lsdException w:name="Dark List Accent 1" w:semiHidden="0" w:uiPriority="70" w:unhideWhenUsed="0"/>
-    <w:lsdException w:name="Colorful Shading Accent 1" w:semiHidden="0" w:uiPriority="71" w:unhideWhenUsed="0"/>
-    <w:lsdException w:name="Colorful List Accent 1" w:semiHidden="0" w:uiPriority="72" w:unhideWhenUsed="0"/>
-    <w:lsdException w:name="Colorful Grid Accent 1" w:semiHidden="0" w:uiPriority="73" w:unhideWhenUsed="0"/>
-    <w:lsdException w:name="Light Shading Accent 2" w:semiHidden="0" w:uiPriority="60" w:unhideWhenUsed="0"/>
-    <w:lsdException w:name="Light List Accent 2" w:semiHidden="0" w:uiPriority="61" w:unhideWhenUsed="0"/>
-    <w:lsdException w:name="Light Grid Accent 2" w:semiHidden="0" w:uiPriority="62" w:unhideWhenUsed="0"/>
-    <w:lsdException w:name="Medium Shading 1 Accent 2" w:semiHidden="0" w:uiPriority="63" w:unhideWhenUsed="0"/>
-    <w:lsdException w:name="Medium Shading 2 Accent 2" w:semiHidden="0" w:uiPriority="64" w:unhideWhenUsed="0"/>
-    <w:lsdException w:name="Medium List 1 Accent 2" w:semiHidden="0" w:uiPriority="65" w:unhideWhenUsed="0"/>
-    <w:lsdException w:name="Medium List 2 Accent 2" w:semiHidden="0" w:uiPriority="66" w:unhideWhenUsed="0"/>
-    <w:lsdException w:name="Medium Grid 1 Accent 2" w:semiHidden="0" w:uiPriority="67" w:unhideWhenUsed="0"/>
-    <w:lsdException w:name="Medium Grid 2 Accent 2" w:semiHidden="0" w:uiPriority="68" w:unhideWhenUsed="0"/>
-    <w:lsdException w:name="Medium Grid 3 Accent 2" w:semiHidden="0" w:uiPriority="69" w:unhideWhenUsed="0"/>
-    <w:lsdException w:name="Dark List Accent 2" w:semiHidden="0" w:uiPriority="70" w:unhideWhenUsed="0"/>
-    <w:lsdException w:name="Colorful Shading Accent 2" w:semiHidden="0" w:uiPriority="71" w:unhideWhenUsed="0"/>
-    <w:lsdException w:name="Colorful List Accent 2" w:semiHidden="0" w:uiPriority="72" w:unhideWhenUsed="0"/>
-    <w:lsdException w:name="Colorful Grid Accent 2" w:semiHidden="0" w:uiPriority="73" w:unhideWhenUsed="0"/>
-    <w:lsdException w:name="Light Shading Accent 3" w:semiHidden="0" w:uiPriority="60" w:unhideWhenUsed="0"/>
-    <w:lsdException w:name="Light List Accent 3" w:semiHidden="0" w:uiPriority="61" w:unhideWhenUsed="0"/>
-    <w:lsdException w:name="Light Grid Accent 3" w:semiHidden="0" w:uiPriority="62" w:unhideWhenUsed="0"/>
-    <w:lsdException w:name="Medium Shading 1 Accent 3" w:semiHidden="0" w:uiPriority="63" w:unhideWhenUsed="0"/>
-    <w:lsdException w:name="Medium Shading 2 Accent 3" w:semiHidden="0" w:uiPriority="64" w:unhideWhenUsed="0"/>
-    <w:lsdException w:name="Medium List 1 Accent 3" w:semiHidden="0" w:uiPriority="65" w:unhideWhenUsed="0"/>
-    <w:lsdException w:name="Medium List 2 Accent 3" w:semiHidden="0" w:uiPriority="66" w:unhideWhenUsed="0"/>
-    <w:lsdException w:name="Medium Grid 1 Accent 3" w:semiHidden="0" w:uiPriority="67" w:unhideWhenUsed="0"/>
-    <w:lsdException w:name="Medium Grid 2 Accent 3" w:semiHidden="0" w:uiPriority="68" w:unhideWhenUsed="0"/>
-    <w:lsdException w:name="Medium Grid 3 Accent 3" w:semiHidden="0" w:uiPriority="69" w:unhideWhenUsed="0"/>
-    <w:lsdException w:name="Dark List Accent 3" w:semiHidden="0" w:uiPriority="70" w:unhideWhenUsed="0"/>
-    <w:lsdException w:name="Colorful Shading Accent 3" w:semiHidden="0" w:uiPriority="71" w:unhideWhenUsed="0"/>
-    <w:lsdException w:name="Colorful List Accent 3" w:semiHidden="0" w:uiPriority="72" w:unhideWhenUsed="0"/>
-    <w:lsdException w:name="Colorful Grid Accent 3" w:semiHidden="0" w:uiPriority="73" w:unhideWhenUsed="0"/>
-    <w:lsdException w:name="Light Shading Accent 4" w:semiHidden="0" w:uiPriority="60" w:unhideWhenUsed="0"/>
-    <w:lsdException w:name="Light List Accent 4" w:semiHidden="0" w:uiPriority="61" w:unhideWhenUsed="0"/>
-    <w:lsdException w:name="Light Grid Accent 4" w:semiHidden="0" w:uiPriority="62" w:unhideWhenUsed="0"/>
-    <w:lsdException w:name="Medium Shading 1 Accent 4" w:semiHidden="0" w:uiPriority="63" w:unhideWhenUsed="0"/>
-    <w:lsdException w:name="Medium Shading 2 Accent 4" w:semiHidden="0" w:uiPriority="64" w:unhideWhenUsed="0"/>
-    <w:lsdException w:name="Medium List 1 Accent 4" w:semiHidden="0" w:uiPriority="65" w:unhideWhenUsed="0"/>
-    <w:lsdException w:name="Medium List 2 Accent 4" w:semiHidden="0" w:uiPriority="66" w:unhideWhenUsed="0"/>
-    <w:lsdException w:name="Medium Grid 1 Accent 4" w:semiHidden="0" w:uiPriority="67" w:unhideWhenUsed="0"/>
-    <w:lsdException w:name="Medium Grid 2 Accent 4" w:semiHidden="0" w:uiPriority="68" w:unhideWhenUsed="0"/>
-    <w:lsdException w:name="Medium Grid 3 Accent 4" w:semiHidden="0" w:uiPriority="69" w:unhideWhenUsed="0"/>
-    <w:lsdException w:name="Dark List Accent 4" w:semiHidden="0" w:uiPriority="70" w:unhideWhenUsed="0"/>
-    <w:lsdException w:name="Colorful Shading Accent 4" w:semiHidden="0" w:uiPriority="71" w:unhideWhenUsed="0"/>
-    <w:lsdException w:name="Colorful List Accent 4" w:semiHidden="0" w:uiPriority="72" w:unhideWhenUsed="0"/>
-    <w:lsdException w:name="Colorful Grid Accent 4" w:semiHidden="0" w:uiPriority="73" w:unhideWhenUsed="0"/>
-    <w:lsdException w:name="Light Shading Accent 5" w:semiHidden="0" w:uiPriority="60" w:unhideWhenUsed="0"/>
-    <w:lsdException w:name="Light List Accent 5" w:semiHidden="0" w:uiPriority="61" w:unhideWhenUsed="0"/>
-    <w:lsdException w:name="Light Grid Accent 5" w:semiHidden="0" w:uiPriority="62" w:unhideWhenUsed="0"/>
-    <w:lsdException w:name="Medium Shading 1 Accent 5" w:semiHidden="0" w:uiPriority="63" w:unhideWhenUsed="0"/>
-    <w:lsdException w:name="Medium Shading 2 Accent 5" w:semiHidden="0" w:uiPriority="64" w:unhideWhenUsed="0"/>
-    <w:lsdException w:name="Medium List 1 Accent 5" w:semiHidden="0" w:uiPriority="65" w:unhideWhenUsed="0"/>
-    <w:lsdException w:name="Medium List 2 Accent 5" w:semiHidden="0" w:uiPriority="66" w:unhideWhenUsed="0"/>
-    <w:lsdException w:name="Medium Grid 1 Accent 5" w:semiHidden="0" w:uiPriority="67" w:unhideWhenUsed="0"/>
-    <w:lsdException w:name="Medium Grid 2 Accent 5" w:semiHidden="0" w:uiPriority="68" w:unhideWhenUsed="0"/>
-    <w:lsdException w:name="Medium Grid 3 Accent 5" w:semiHidden="0" w:uiPriority="69" w:unhideWhenUsed="0"/>
-    <w:lsdException w:name="Dark List Accent 5" w:semiHidden="0" w:uiPriority="70" w:unhideWhenUsed="0"/>
-    <w:lsdException w:name="Colorful Shading Accent 5" w:semiHidden="0" w:uiPriority="71" w:unhideWhenUsed="0"/>
-    <w:lsdException w:name="Colorful List Accent 5" w:semiHidden="0" w:uiPriority="72" w:unhideWhenUsed="0"/>
-    <w:lsdException w:name="Colorful Grid Accent 5" w:semiHidden="0" w:uiPriority="73" w:unhideWhenUsed="0"/>
-    <w:lsdException w:name="Light Shading Accent 6" w:semiHidden="0" w:uiPriority="60" w:unhideWhenUsed="0"/>
-    <w:lsdException w:name="Light List Accent 6" w:semiHidden="0" w:uiPriority="61" w:unhideWhenUsed="0"/>
-    <w:lsdException w:name="Light Grid Accent 6" w:semiHidden="0" w:uiPriority="62" w:unhideWhenUsed="0"/>
-    <w:lsdException w:name="Medium Shading 1 Accent 6" w:semiHidden="0" w:uiPriority="63" w:unhideWhenUsed="0"/>
-    <w:lsdException w:name="Medium Shading 2 Accent 6" w:semiHidden="0" w:uiPriority="64" w:unhideWhenUsed="0"/>
-    <w:lsdException w:name="Medium List 1 Accent 6" w:semiHidden="0" w:uiPriority="65" w:unhideWhenUsed="0"/>
-    <w:lsdException w:name="Medium List 2 Accent 6" w:semiHidden="0" w:uiPriority="66" w:unhideWhenUsed="0"/>
-    <w:lsdException w:name="Medium Grid 1 Accent 6" w:semiHidden="0" w:uiPriority="67" w:unhideWhenUsed="0"/>
-    <w:lsdException w:name="Medium Grid 2 Accent 6" w:semiHidden="0" w:uiPriority="68" w:unhideWhenUsed="0"/>
-    <w:lsdException w:name="Medium Grid 3 Accent 6" w:semiHidden="0" w:uiPriority="69" w:unhideWhenUsed="0"/>
-    <w:lsdException w:name="Dark List Accent 6" w:semiHidden="0" w:uiPriority="70" w:unhideWhenUsed="0"/>
-    <w:lsdException w:name="Colorful Shading Accent 6" w:semiHidden="0" w:uiPriority="71" w:unhideWhenUsed="0"/>
-    <w:lsdException w:name="Colorful List Accent 6" w:semiHidden="0" w:uiPriority="72" w:unhideWhenUsed="0"/>
-    <w:lsdException w:name="Colorful Grid Accent 6" w:semiHidden="0" w:uiPriority="73" w:unhideWhenUsed="0"/>
-    <w:lsdException w:name="Subtle Emphasis" w:semiHidden="0" w:uiPriority="19" w:unhideWhenUsed="0" w:qFormat="1"/>
-    <w:lsdException w:name="Intense Emphasis" w:semiHidden="0" w:uiPriority="21" w:unhideWhenUsed="0" w:qFormat="1"/>
-    <w:lsdException w:name="Subtle Reference" w:semiHidden="0" w:uiPriority="31" w:unhideWhenUsed="0" w:qFormat="1"/>
-    <w:lsdException w:name="Intense Reference" w:semiHidden="0" w:uiPriority="32" w:unhideWhenUsed="0" w:qFormat="1"/>
-    <w:lsdException w:name="Book Title" w:semiHidden="0" w:uiPriority="33" w:unhideWhenUsed="0" w:qFormat="1"/>
-    <w:lsdException w:name="Bibliography" w:uiPriority="37"/>
-    <w:lsdException w:name="TOC Heading" w:uiPriority="39" w:qFormat="1"/>
-  </w:latentStyles>
-  <w:style w:type="paragraph" w:default="1" w:styleId="Normal">
-    <w:name w:val="Normal"/>
-    <w:qFormat/>
-  </w:style>
-  <w:style w:type="character" w:default="1" w:styleId="DefaultParagraphFont">
-    <w:name w:val="Default Paragraph Font"/>
-    <w:uiPriority w:val="1"/>
-    <w:semiHidden/>
-    <w:unhideWhenUsed/>
-  </w:style>
-  <w:style w:type="table" w:default="1" w:styleId="TableNormal">
-    <w:name w:val="Normal Table"/>
-    <w:uiPriority w:val="99"/>
-    <w:semiHidden/>
-    <w:unhideWhenUsed/>
-    <w:tblPr>
-      <w:tblInd w:w="0" w:type="dxa"/>
-      <w:tblCellMar>
-        <w:top w:w="0" w:type="dxa"/>
-        <w:left w:w="108" w:type="dxa"/>
-        <w:bottom w:w="0" w:type="dxa"/>
-        <w:right w:w="108" w:type="dxa"/>
-      </w:tblCellMar>
-    </w:tblPr>
-  </w:style>
-  <w:style w:type="numbering" w:default="1" w:styleId="NoList">
-    <w:name w:val="No List"/>
-    <w:uiPriority w:val="99"/>
-    <w:semiHidden/>
-    <w:unhideWhenUsed/>
-  </w:style>
-  <w:style w:type="character" w:styleId="PlaceholderText">
-    <w:name w:val="Placeholder Text"/>
-    <w:basedOn w:val="DefaultParagraphFont"/>
-    <w:uiPriority w:val="99"/>
-    <w:semiHidden/>
-    <w:rsid w:val="00B22B90"/>
-    <w:rPr>
-      <w:color w:val="808080"/>
-    </w:rPr>
-  </w:style>
-</w:styles>
-</file>
-
-<file path=word/glossary/webSettings.xml><?xml version="1.0" encoding="utf-8"?>
-<w:webSettings xmlns:mc="http://schemas.openxmlformats.org/markup-compatibility/2006" xmlns:r="http://schemas.openxmlformats.org/officeDocument/2006/relationships" xmlns:w="http://schemas.openxmlformats.org/wordprocessingml/2006/main" xmlns:w14="http://schemas.microsoft.com/office/word/2010/wordml" mc:Ignorable="w14">
-  <w:optimizeForBrowser/>
-  <w:allowPNG/>
-</w:webSettings>
-</file>
-
 <file path=word/theme/theme1.xml><?xml version="1.0" encoding="utf-8"?>
 <a:theme xmlns:a="http://schemas.openxmlformats.org/drawingml/2006/main" name="Office Theme">
   <a:themeElements>
@@ -23373,7 +22866,7 @@
 </file>
 
 <file path=customXml/itemProps1.xml><?xml version="1.0" encoding="utf-8"?>
-<ds:datastoreItem xmlns:ds="http://schemas.openxmlformats.org/officeDocument/2006/customXml" ds:itemID="{513996A6-2CF9-4E31-9B54-E272DE033B2C}">
+<ds:datastoreItem xmlns:ds="http://schemas.openxmlformats.org/officeDocument/2006/customXml" ds:itemID="{4C8BEF85-672D-4EC3-BCE7-4C338A474BFA}">
   <ds:schemaRefs>
     <ds:schemaRef ds:uri="http://schemas.openxmlformats.org/officeDocument/2006/bibliography"/>
   </ds:schemaRefs>

</xml_diff>